<commit_message>
docs: sửa nội dung đề cương cho khớp source code hiện tại
- Bỏ claim OAuth2 Resource Server chưa wiring, ghi rõ JWT tự triển khai bằng Nimbus JOSE
- Bỏ claim Testcontainers/integration test DB thật ở backend Java, làm rõ phần này nằm ở Playwright E2E
- Ghi chú RBAC matrix và threat model hiện còn mô tả kiến trúc Express cũ, cần cập nhật lại

Co-Authored-By: Claude Sonnet 5 <noreply@anthropic.com>
Claude-Session: https://claude.ai/code/session_01EKtn2PSvouTZshqTEfaFVG
</commit_message>
<xml_diff>
--- a/UIT_Career_Hub_Detailed_Project_Proposal.docx
+++ b/UIT_Career_Hub_Detailed_Project_Proposal.docx
@@ -2535,7 +2535,7 @@
               <w:ind w:left="920"/>
             </w:pPr>
             <w:r>
-              <w:t>Integration test với PostgreSQL cho state transition, transaction, unique constraint, audit, notification và idempotency.</w:t>
+              <w:t>Kiểm thử tích hợp với PostgreSQL cho state transition, transaction, unique constraint, audit, notification và idempotency hiện được phủ qua Playwright E2E; backend Java hiện chỉ có unit test (Mockito) cho tầng validation/service, chưa dùng Testcontainers.</w:t>
             </w:r>
           </w:p>
           <w:p>
@@ -2653,7 +2653,7 @@
                 <w:color w:val="000000"/>
                 <w:sz w:val="26"/>
               </w:rPr>
-              <w:t>Java 21, Spring Boot 3.5, Spring Web, Spring Security, OAuth2 Resource Server, Validation, JDBC và Actuator.</w:t>
+              <w:t>Java 21, Spring Boot 3.5, Spring Web, Spring Security, Validation, JDBC và Actuator; xác thực JWT tự triển khai bằng thư viện Nimbus JOSE (chưa dùng cơ chế OAuth2 Resource Server có sẵn của Spring).</w:t>
             </w:r>
           </w:p>
           <w:p>
@@ -2758,7 +2758,7 @@
                 <w:color w:val="000000"/>
                 <w:sz w:val="26"/>
               </w:rPr>
-              <w:t>JUnit/Spring Test/Testcontainers, Node test, Playwright, Maven Wrapper, pnpm và GitHub Actions.</w:t>
+              <w:t>JUnit/Spring Test (unit, Mockito) cho backend Java, Playwright cho E2E tích hợp PostgreSQL thật, Node test, Maven Wrapper, pnpm và GitHub Actions.</w:t>
             </w:r>
           </w:p>
           <w:p>
@@ -2880,7 +2880,7 @@
               <w:ind w:left="920"/>
             </w:pPr>
             <w:r>
-              <w:t>Đã có OpenAPI, migration, state machine, RBAC matrix, threat model, kịch bản demo và các bộ kiểm thử tự động.</w:t>
+              <w:t>Đã có OpenAPI, migration, state machine, kịch bản demo và các bộ kiểm thử tự động; RBAC matrix và threat model đã có nhưng còn mô tả theo kiến trúc Express cũ, cần cập nhật lại theo backend Java/Spring Boot hiện tại.</w:t>
             </w:r>
           </w:p>
           <w:p>

</xml_diff>